<commit_message>
Daily job matches - 2026-10-24
</commit_message>
<xml_diff>
--- a/tailored_resumes/greenhouse-alphasenseindia-8540721002.docx
+++ b/tailored_resumes/greenhouse-alphasenseindia-8540721002.docx
@@ -25,7 +25,7 @@
     </w:p>
     <w:p>
       <w:r>
-        <w:t>Entry-level professional with a foundation in AI fundamentals and data analytics, skilled in Python and SQL. Proven ability to identify digital risks and conduct data-driven investigations, with a background in digital fraud prevention and system reliability verification.</w:t>
+        <w:t>Electronics and Communication Engineering graduate with foundational knowledge in AI, Python, and forensic technology data analysis. Experienced in classifying data, detecting digital fraud risks, and developing analytical dashboards, seeking to support AI telemetry monitoring and security governance initiatives.</w:t>
       </w:r>
     </w:p>
     <w:p>
@@ -38,7 +38,7 @@
     </w:p>
     <w:p>
       <w:r>
-        <w:t>Python, AI Fundamentals, SQL, Data Visualization, Digital Fraud Prevention, Database Design, Excel</w:t>
+        <w:t>AI fundamentals, Python, SQL, Excel, Data Visualization, Database Design</w:t>
       </w:r>
     </w:p>
     <w:p>
@@ -62,7 +62,7 @@
         <w:pStyle w:val="ListBullet"/>
       </w:pPr>
       <w:r>
-        <w:t>Completed a Deloitte job simulation focused on data analysis and forensic technology to identify and triage risks.</w:t>
+        <w:t>Completed a data analytics and forensic technology simulation focused on analyzing telemetry and classifying data to assess business risks</w:t>
       </w:r>
     </w:p>
     <w:p>
@@ -70,7 +70,7 @@
         <w:pStyle w:val="ListBullet"/>
       </w:pPr>
       <w:r>
-        <w:t>Utilized Excel to classify complex data sets and draw actionable business conclusions regarding potential anomalies.</w:t>
+        <w:t>Utilized Excel to categorize and classify data findings to support risk investigation and operational conclusions</w:t>
       </w:r>
     </w:p>
     <w:p>
@@ -78,7 +78,7 @@
         <w:pStyle w:val="ListBullet"/>
       </w:pPr>
       <w:r>
-        <w:t>Created data dashboards using Tableau to visualize telemetry and support risk-based decision-making.</w:t>
+        <w:t>Developed an interactive Tableau dashboard to visualize complex data points and support actionable reporting</w:t>
       </w:r>
     </w:p>
     <w:p>
@@ -110,7 +110,7 @@
         <w:pStyle w:val="ListBullet"/>
       </w:pPr>
       <w:r>
-        <w:t>Conducted a community service project on digital frauds, focusing on phishing, online scams, and cyber fraud prevention strategies.</w:t>
+        <w:t>Investigated cyber security threats, analyzing vectors for online scams, phishing, and digital fraud prevention to mitigate security risks</w:t>
       </w:r>
     </w:p>
     <w:p>
@@ -118,7 +118,7 @@
         <w:pStyle w:val="ListBullet"/>
       </w:pPr>
       <w:r>
-        <w:t>Identified and resolved risks in complex designs to improve reliability and detect potential system failures.</w:t>
+        <w:t>Prepared risk awareness materials and conducted structured sessions on safe digital practices and threat avoidance</w:t>
       </w:r>
     </w:p>
     <w:p>
@@ -126,7 +126,7 @@
         <w:pStyle w:val="ListBullet"/>
       </w:pPr>
       <w:r>
-        <w:t>Implemented verification strategies using industry-standard tools to ensure design integrity and mitigate metastability risks.</w:t>
+        <w:t>Conducted rigorous verification and risk detection using standard technical tools to identify metastability failure points and improve system reliability</w:t>
       </w:r>
     </w:p>
     <w:p>

</xml_diff>

<commit_message>
Daily job matches - 2026-10-25
</commit_message>
<xml_diff>
--- a/tailored_resumes/greenhouse-alphasenseindia-8540721002.docx
+++ b/tailored_resumes/greenhouse-alphasenseindia-8540721002.docx
@@ -25,7 +25,7 @@
     </w:p>
     <w:p>
       <w:r>
-        <w:t>Electronics and Communication Engineering graduate with foundational knowledge in AI, Python, and forensic technology data analysis. Experienced in classifying data, detecting digital fraud risks, and developing analytical dashboards, seeking to support AI telemetry monitoring and security governance initiatives.</w:t>
+        <w:t>Detail-oriented B.Tech graduate in Electronics and Communication Engineering with foundational training in AI fundamentals, Python, SQL, and cyber fraud prevention. Demonstrated ability in data classification, forensic technology simulations, and issue verification to analyze data sets and detect potential risks. Eager to apply analytical and data-driven problem-solving skills to support enterprise AI monitoring, risk analysis, and governance initiatives.</w:t>
       </w:r>
     </w:p>
     <w:p>
@@ -38,7 +38,7 @@
     </w:p>
     <w:p>
       <w:r>
-        <w:t>AI fundamentals, Python, SQL, Excel, Data Visualization, Database Design</w:t>
+        <w:t>AI fundamentals, Python, SQL, Excel, Data Visualization, Database Design, Tableau, Query Optimization</w:t>
       </w:r>
     </w:p>
     <w:p>
@@ -62,7 +62,7 @@
         <w:pStyle w:val="ListBullet"/>
       </w:pPr>
       <w:r>
-        <w:t>Completed a data analytics and forensic technology simulation focused on analyzing telemetry and classifying data to assess business risks</w:t>
+        <w:t>Completed a Deloitte job simulation focused on data analysis and forensic technology to evaluate risks and investigate data patterns.</w:t>
       </w:r>
     </w:p>
     <w:p>
@@ -70,7 +70,7 @@
         <w:pStyle w:val="ListBullet"/>
       </w:pPr>
       <w:r>
-        <w:t>Utilized Excel to categorize and classify data findings to support risk investigation and operational conclusions</w:t>
+        <w:t>Used Excel to classify data sets, run structured analyses, and draw actionable business conclusions.</w:t>
       </w:r>
     </w:p>
     <w:p>
@@ -78,7 +78,7 @@
         <w:pStyle w:val="ListBullet"/>
       </w:pPr>
       <w:r>
-        <w:t>Developed an interactive Tableau dashboard to visualize complex data points and support actionable reporting</w:t>
+        <w:t>Created data dashboards using Tableau to visualize key trends and communicate findings effectively.</w:t>
       </w:r>
     </w:p>
     <w:p>
@@ -110,7 +110,7 @@
         <w:pStyle w:val="ListBullet"/>
       </w:pPr>
       <w:r>
-        <w:t>Investigated cyber security threats, analyzing vectors for online scams, phishing, and digital fraud prevention to mitigate security risks</w:t>
+        <w:t>Analyzed online scams, phishing methods, and cyber fraud prevention techniques to raise awareness and promote safe digital practices.</w:t>
       </w:r>
     </w:p>
     <w:p>
@@ -118,15 +118,7 @@
         <w:pStyle w:val="ListBullet"/>
       </w:pPr>
       <w:r>
-        <w:t>Prepared risk awareness materials and conducted structured sessions on safe digital practices and threat avoidance</w:t>
-      </w:r>
-    </w:p>
-    <w:p>
-      <w:pPr>
-        <w:pStyle w:val="ListBullet"/>
-      </w:pPr>
-      <w:r>
-        <w:t>Conducted rigorous verification and risk detection using standard technical tools to identify metastability failure points and improve system reliability</w:t>
+        <w:t>Identified and resolved technical issues in complex designs, leveraging structured verification strategies to detect risks and enhance reliability.</w:t>
       </w:r>
     </w:p>
     <w:p>

</xml_diff>

<commit_message>
Daily job matches - 2026-10-26
</commit_message>
<xml_diff>
--- a/tailored_resumes/greenhouse-alphasenseindia-8540721002.docx
+++ b/tailored_resumes/greenhouse-alphasenseindia-8540721002.docx
@@ -25,7 +25,7 @@
     </w:p>
     <w:p>
       <w:r>
-        <w:t>Detail-oriented B.Tech graduate in Electronics and Communication Engineering with foundational training in AI fundamentals, Python, SQL, and cyber fraud prevention. Demonstrated ability in data classification, forensic technology simulations, and issue verification to analyze data sets and detect potential risks. Eager to apply analytical and data-driven problem-solving skills to support enterprise AI monitoring, risk analysis, and governance initiatives.</w:t>
+        <w:t>Entry-level B.Tech graduate with foundational knowledge in AI fundamentals, Python, SQL, and data analysis. Experienced in forensic technology, data classification using Excel, and building dashboards in Tableau through a Deloitte job simulation. Proven initiative in digital fraud and cyber risk awareness, ready to support AI security, monitoring, and telemetry analysis.</w:t>
       </w:r>
     </w:p>
     <w:p>
@@ -38,7 +38,7 @@
     </w:p>
     <w:p>
       <w:r>
-        <w:t>AI fundamentals, Python, SQL, Excel, Data Visualization, Database Design, Tableau, Query Optimization</w:t>
+        <w:t>AI fundamentals, Python, SQL, Excel, Tableau, Data Visualization, Database Design, Query Optimization</w:t>
       </w:r>
     </w:p>
     <w:p>
@@ -62,7 +62,7 @@
         <w:pStyle w:val="ListBullet"/>
       </w:pPr>
       <w:r>
-        <w:t>Completed a Deloitte job simulation focused on data analysis and forensic technology to evaluate risks and investigate data patterns.</w:t>
+        <w:t>Completed a Deloitte job simulation focused on data analysis and forensic technology to evaluate risk and extract actionable findings.</w:t>
       </w:r>
     </w:p>
     <w:p>
@@ -70,7 +70,7 @@
         <w:pStyle w:val="ListBullet"/>
       </w:pPr>
       <w:r>
-        <w:t>Used Excel to classify data sets, run structured analyses, and draw actionable business conclusions.</w:t>
+        <w:t>Utilized Excel to analyze and classify data sets, enabling structured evaluation and risk assessment.</w:t>
       </w:r>
     </w:p>
     <w:p>
@@ -78,7 +78,7 @@
         <w:pStyle w:val="ListBullet"/>
       </w:pPr>
       <w:r>
-        <w:t>Created data dashboards using Tableau to visualize key trends and communicate findings effectively.</w:t>
+        <w:t>Designed and created interactive data dashboards using Tableau to clearly communicate analytical conclusions.</w:t>
       </w:r>
     </w:p>
     <w:p>
@@ -110,7 +110,7 @@
         <w:pStyle w:val="ListBullet"/>
       </w:pPr>
       <w:r>
-        <w:t>Analyzed online scams, phishing methods, and cyber fraud prevention techniques to raise awareness and promote safe digital practices.</w:t>
+        <w:t>Led a Community Service Project on Digital Frauds, conducting sessions and preparing educational materials on phishing, online scams, and cyber fraud prevention.</w:t>
       </w:r>
     </w:p>
     <w:p>
@@ -118,7 +118,7 @@
         <w:pStyle w:val="ListBullet"/>
       </w:pPr>
       <w:r>
-        <w:t>Identified and resolved technical issues in complex designs, leveraging structured verification strategies to detect risks and enhance reliability.</w:t>
+        <w:t>Executed Clock Domain Crossing (CDC) verification strategies in SoC designs to identify and resolve reliability risks.</w:t>
       </w:r>
     </w:p>
     <w:p>

</xml_diff>

<commit_message>
Daily job matches - 2026-10-27
</commit_message>
<xml_diff>
--- a/tailored_resumes/greenhouse-alphasenseindia-8540721002.docx
+++ b/tailored_resumes/greenhouse-alphasenseindia-8540721002.docx
@@ -25,7 +25,7 @@
     </w:p>
     <w:p>
       <w:r>
-        <w:t>Entry-level B.Tech graduate with foundational knowledge in AI fundamentals, Python, SQL, and data analysis. Experienced in forensic technology, data classification using Excel, and building dashboards in Tableau through a Deloitte job simulation. Proven initiative in digital fraud and cyber risk awareness, ready to support AI security, monitoring, and telemetry analysis.</w:t>
+        <w:t>Entry-level professional with a foundation in AI fundamentals and Python, seeking to apply data analytics and security verification skills to the AI Security Engineer role. Experienced in identifying risks through hardware verification and raising awareness on digital fraud and cyber security prevention.</w:t>
       </w:r>
     </w:p>
     <w:p>
@@ -38,7 +38,7 @@
     </w:p>
     <w:p>
       <w:r>
-        <w:t>AI fundamentals, Python, SQL, Excel, Tableau, Data Visualization, Database Design, Query Optimization</w:t>
+        <w:t>Python, AI Fundamentals, Data Analysis, SQL, Digital Fraud Prevention, Risk Identification, Tableau, Excel</w:t>
       </w:r>
     </w:p>
     <w:p>
@@ -62,7 +62,7 @@
         <w:pStyle w:val="ListBullet"/>
       </w:pPr>
       <w:r>
-        <w:t>Completed a Deloitte job simulation focused on data analysis and forensic technology to evaluate risk and extract actionable findings.</w:t>
+        <w:t>Analyzed data and forensic technology scenarios during a Deloitte job simulation to draw risk-based business conclusions.</w:t>
       </w:r>
     </w:p>
     <w:p>
@@ -70,7 +70,7 @@
         <w:pStyle w:val="ListBullet"/>
       </w:pPr>
       <w:r>
-        <w:t>Utilized Excel to analyze and classify data sets, enabling structured evaluation and risk assessment.</w:t>
+        <w:t>Developed data dashboards in Tableau to visualize findings and classify data for actionable insights.</w:t>
       </w:r>
     </w:p>
     <w:p>
@@ -78,7 +78,7 @@
         <w:pStyle w:val="ListBullet"/>
       </w:pPr>
       <w:r>
-        <w:t>Designed and created interactive data dashboards using Tableau to clearly communicate analytical conclusions.</w:t>
+        <w:t>Utilized Excel for data classification and identifying patterns to support security and governance decision-making.</w:t>
       </w:r>
     </w:p>
     <w:p>
@@ -110,7 +110,7 @@
         <w:pStyle w:val="ListBullet"/>
       </w:pPr>
       <w:r>
-        <w:t>Led a Community Service Project on Digital Frauds, conducting sessions and preparing educational materials on phishing, online scams, and cyber fraud prevention.</w:t>
+        <w:t>Conducted a community service project focused on digital frauds, phishing, and cyber fraud prevention to improve security awareness.</w:t>
       </w:r>
     </w:p>
     <w:p>
@@ -118,7 +118,15 @@
         <w:pStyle w:val="ListBullet"/>
       </w:pPr>
       <w:r>
-        <w:t>Executed Clock Domain Crossing (CDC) verification strategies in SoC designs to identify and resolve reliability risks.</w:t>
+        <w:t>Identified and resolved risks in complex designs through CDC verification, ensuring system reliability and detecting potential failures.</w:t>
+      </w:r>
+    </w:p>
+    <w:p>
+      <w:pPr>
+        <w:pStyle w:val="ListBullet"/>
+      </w:pPr>
+      <w:r>
+        <w:t>Prepared materials and conducted sessions on safe digital practices and cyber security risk mitigation.</w:t>
       </w:r>
     </w:p>
     <w:p>

</xml_diff>

<commit_message>
Daily job matches - 2026-10-28
</commit_message>
<xml_diff>
--- a/tailored_resumes/greenhouse-alphasenseindia-8540721002.docx
+++ b/tailored_resumes/greenhouse-alphasenseindia-8540721002.docx
@@ -25,7 +25,7 @@
     </w:p>
     <w:p>
       <w:r>
-        <w:t>Entry-level professional with a foundation in AI fundamentals and Python, seeking to apply data analytics and security verification skills to the AI Security Engineer role. Experienced in identifying risks through hardware verification and raising awareness on digital fraud and cyber security prevention.</w:t>
+        <w:t>Recent B.Tech Electronics and Communication Engineering graduate with foundational knowledge in AI, digital fraud prevention awareness, and data analysis using Python and SQL. Brings practical exposure to forensic technology and data classification from a Deloitte simulation, alongside a disciplined engineering background. Eager to apply data visualization, risk identification, and technical problem-solving skills to support enterprise AI security and telemetry monitoring.</w:t>
       </w:r>
     </w:p>
     <w:p>
@@ -38,7 +38,7 @@
     </w:p>
     <w:p>
       <w:r>
-        <w:t>Python, AI Fundamentals, Data Analysis, SQL, Digital Fraud Prevention, Risk Identification, Tableau, Excel</w:t>
+        <w:t>AI fundamentals, Python, SQL, Excel, Tableau, Data Visualization, Query Optimization</w:t>
       </w:r>
     </w:p>
     <w:p>
@@ -62,7 +62,7 @@
         <w:pStyle w:val="ListBullet"/>
       </w:pPr>
       <w:r>
-        <w:t>Analyzed data and forensic technology scenarios during a Deloitte job simulation to draw risk-based business conclusions.</w:t>
+        <w:t>Completed a Deloitte job simulation centered on data analysis, data classification, and forensic technology.</w:t>
       </w:r>
     </w:p>
     <w:p>
@@ -70,7 +70,7 @@
         <w:pStyle w:val="ListBullet"/>
       </w:pPr>
       <w:r>
-        <w:t>Developed data dashboards in Tableau to visualize findings and classify data for actionable insights.</w:t>
+        <w:t>Utilized Excel to classify datasets and draw structured analytical conclusions.</w:t>
       </w:r>
     </w:p>
     <w:p>
@@ -78,7 +78,7 @@
         <w:pStyle w:val="ListBullet"/>
       </w:pPr>
       <w:r>
-        <w:t>Utilized Excel for data classification and identifying patterns to support security and governance decision-making.</w:t>
+        <w:t>Created data dashboards using Tableau to effectively visualize key insights.</w:t>
       </w:r>
     </w:p>
     <w:p>
@@ -110,7 +110,7 @@
         <w:pStyle w:val="ListBullet"/>
       </w:pPr>
       <w:r>
-        <w:t>Conducted a community service project focused on digital frauds, phishing, and cyber fraud prevention to improve security awareness.</w:t>
+        <w:t>Conducted informational sessions and prepared educational materials on digital fraud, phishing, and cyber scam prevention.</w:t>
       </w:r>
     </w:p>
     <w:p>
@@ -118,15 +118,7 @@
         <w:pStyle w:val="ListBullet"/>
       </w:pPr>
       <w:r>
-        <w:t>Identified and resolved risks in complex designs through CDC verification, ensuring system reliability and detecting potential failures.</w:t>
-      </w:r>
-    </w:p>
-    <w:p>
-      <w:pPr>
-        <w:pStyle w:val="ListBullet"/>
-      </w:pPr>
-      <w:r>
-        <w:t>Prepared materials and conducted sessions on safe digital practices and cyber security risk mitigation.</w:t>
+        <w:t>Implemented structured verification strategies using industry-standard tools to identify risks, resolve complex technical issues, and improve design reliability.</w:t>
       </w:r>
     </w:p>
     <w:p>

</xml_diff>

<commit_message>
Daily job matches - 2026-10-29
</commit_message>
<xml_diff>
--- a/tailored_resumes/greenhouse-alphasenseindia-8540721002.docx
+++ b/tailored_resumes/greenhouse-alphasenseindia-8540721002.docx
@@ -25,7 +25,7 @@
     </w:p>
     <w:p>
       <w:r>
-        <w:t>Recent B.Tech Electronics and Communication Engineering graduate with foundational knowledge in AI, digital fraud prevention awareness, and data analysis using Python and SQL. Brings practical exposure to forensic technology and data classification from a Deloitte simulation, alongside a disciplined engineering background. Eager to apply data visualization, risk identification, and technical problem-solving skills to support enterprise AI security and telemetry monitoring.</w:t>
+        <w:t>Entry-level engineering graduate with a foundation in AI fundamentals, Python, and SQL, complemented by hands-on data analytics and forensic technology simulation experience. Demonstrates strong analytical skills with a focus on data classification, digital fraud awareness, and safe digital practices.</w:t>
       </w:r>
     </w:p>
     <w:p>
@@ -38,7 +38,7 @@
     </w:p>
     <w:p>
       <w:r>
-        <w:t>AI fundamentals, Python, SQL, Excel, Tableau, Data Visualization, Query Optimization</w:t>
+        <w:t>AI fundamentals, Python, SQL, Excel, Data Visualization, Database Design</w:t>
       </w:r>
     </w:p>
     <w:p>
@@ -62,7 +62,7 @@
         <w:pStyle w:val="ListBullet"/>
       </w:pPr>
       <w:r>
-        <w:t>Completed a Deloitte job simulation centered on data analysis, data classification, and forensic technology.</w:t>
+        <w:t>Executed a data analytics job simulation focused on data analysis and forensic technology techniques</w:t>
       </w:r>
     </w:p>
     <w:p>
@@ -70,7 +70,7 @@
         <w:pStyle w:val="ListBullet"/>
       </w:pPr>
       <w:r>
-        <w:t>Utilized Excel to classify datasets and draw structured analytical conclusions.</w:t>
+        <w:t>Leveraged Excel for structured data classification and deriving business insights</w:t>
       </w:r>
     </w:p>
     <w:p>
@@ -78,7 +78,7 @@
         <w:pStyle w:val="ListBullet"/>
       </w:pPr>
       <w:r>
-        <w:t>Created data dashboards using Tableau to effectively visualize key insights.</w:t>
+        <w:t>Designed and built interactive data dashboards using Tableau to present analytical findings</w:t>
       </w:r>
     </w:p>
     <w:p>
@@ -110,7 +110,7 @@
         <w:pStyle w:val="ListBullet"/>
       </w:pPr>
       <w:r>
-        <w:t>Conducted informational sessions and prepared educational materials on digital fraud, phishing, and cyber scam prevention.</w:t>
+        <w:t>Led community outreach sessions and created informative materials focused on online scams, phishing, and cyber fraud prevention</w:t>
       </w:r>
     </w:p>
     <w:p>
@@ -118,7 +118,7 @@
         <w:pStyle w:val="ListBullet"/>
       </w:pPr>
       <w:r>
-        <w:t>Implemented structured verification strategies using industry-standard tools to identify risks, resolve complex technical issues, and improve design reliability.</w:t>
+        <w:t>Executed Clock Domain Crossing (CDC) verification strategies using industry-standard tools to identify risks and improve design reliability</w:t>
       </w:r>
     </w:p>
     <w:p>

</xml_diff>

<commit_message>
Daily job matches - 2026-10-30
</commit_message>
<xml_diff>
--- a/tailored_resumes/greenhouse-alphasenseindia-8540721002.docx
+++ b/tailored_resumes/greenhouse-alphasenseindia-8540721002.docx
@@ -25,7 +25,7 @@
     </w:p>
     <w:p>
       <w:r>
-        <w:t>Entry-level engineering graduate with a foundation in AI fundamentals, Python, and SQL, complemented by hands-on data analytics and forensic technology simulation experience. Demonstrates strong analytical skills with a focus on data classification, digital fraud awareness, and safe digital practices.</w:t>
+        <w:t>Detail-oriented B.Tech graduate in Electronics and Communication Engineering with foundational knowledge in AI fundamentals, Python, SQL, and digital fraud prevention. Possesses practical experience in forensic data analysis, data classification, and dashboard creation from a Deloitte analytics simulation. Eager to leverage strong analytical abilities and risk identification skills to support AI tool monitoring and security telemetry at AlphaSense.</w:t>
       </w:r>
     </w:p>
     <w:p>
@@ -38,7 +38,7 @@
     </w:p>
     <w:p>
       <w:r>
-        <w:t>AI fundamentals, Python, SQL, Excel, Data Visualization, Database Design</w:t>
+        <w:t>AI fundamentals, Python, SQL, Excel, Data Visualization, Tableau</w:t>
       </w:r>
     </w:p>
     <w:p>
@@ -62,7 +62,7 @@
         <w:pStyle w:val="ListBullet"/>
       </w:pPr>
       <w:r>
-        <w:t>Executed a data analytics job simulation focused on data analysis and forensic technology techniques</w:t>
+        <w:t>Executed forensic technology and data analysis tasks within a Deloitte job simulation to evaluate and classify enterprise data</w:t>
       </w:r>
     </w:p>
     <w:p>
@@ -70,7 +70,7 @@
         <w:pStyle w:val="ListBullet"/>
       </w:pPr>
       <w:r>
-        <w:t>Leveraged Excel for structured data classification and deriving business insights</w:t>
+        <w:t>Created an analytical data dashboard using Tableau to visualize telemetry and operational metrics</w:t>
       </w:r>
     </w:p>
     <w:p>
@@ -78,7 +78,7 @@
         <w:pStyle w:val="ListBullet"/>
       </w:pPr>
       <w:r>
-        <w:t>Designed and built interactive data dashboards using Tableau to present analytical findings</w:t>
+        <w:t>Utilized Excel to classify data sets and derive structured business conclusions</w:t>
       </w:r>
     </w:p>
     <w:p>
@@ -110,7 +110,7 @@
         <w:pStyle w:val="ListBullet"/>
       </w:pPr>
       <w:r>
-        <w:t>Led community outreach sessions and created informative materials focused on online scams, phishing, and cyber fraud prevention</w:t>
+        <w:t>Raised public awareness on cyber fraud prevention, phishing vectors, and safe digital practices through structured outreach sessions</w:t>
       </w:r>
     </w:p>
     <w:p>
@@ -118,7 +118,7 @@
         <w:pStyle w:val="ListBullet"/>
       </w:pPr>
       <w:r>
-        <w:t>Executed Clock Domain Crossing (CDC) verification strategies using industry-standard tools to identify risks and improve design reliability</w:t>
+        <w:t>Identified and resolved Clock Domain Crossing reliability risks in complex SoC designs using verification strategies</w:t>
       </w:r>
     </w:p>
     <w:p>

</xml_diff>

<commit_message>
Daily job matches - 2026-10-31
</commit_message>
<xml_diff>
--- a/tailored_resumes/greenhouse-alphasenseindia-8540721002.docx
+++ b/tailored_resumes/greenhouse-alphasenseindia-8540721002.docx
@@ -25,7 +25,7 @@
     </w:p>
     <w:p>
       <w:r>
-        <w:t>Detail-oriented B.Tech graduate in Electronics and Communication Engineering with foundational knowledge in AI fundamentals, Python, SQL, and digital fraud prevention. Possesses practical experience in forensic data analysis, data classification, and dashboard creation from a Deloitte analytics simulation. Eager to leverage strong analytical abilities and risk identification skills to support AI tool monitoring and security telemetry at AlphaSense.</w:t>
+        <w:t>B.Tech in Electronics and Communication Engineering graduate with foundational knowledge in AI principles, Python, SQL, and data analytics. Possesses practical experience from data analytics and forensic technology simulations alongside project work focused on cyber fraud prevention and digital security awareness. Eager to leverage technical analysis, data visualization, and risk detection skills to support AI security and governance initiatives.</w:t>
       </w:r>
     </w:p>
     <w:p>
@@ -38,7 +38,7 @@
     </w:p>
     <w:p>
       <w:r>
-        <w:t>AI fundamentals, Python, SQL, Excel, Data Visualization, Tableau</w:t>
+        <w:t>AI fundamentals, Python, SQL, Excel, Data Visualization, Tableau, Database Design, Query Optimization</w:t>
       </w:r>
     </w:p>
     <w:p>
@@ -62,7 +62,7 @@
         <w:pStyle w:val="ListBullet"/>
       </w:pPr>
       <w:r>
-        <w:t>Executed forensic technology and data analysis tasks within a Deloitte job simulation to evaluate and classify enterprise data</w:t>
+        <w:t>Executed data analysis and forensic technology tasks during a Deloitte simulated workplace scenario to evaluate data sets and identify findings.</w:t>
       </w:r>
     </w:p>
     <w:p>
@@ -70,7 +70,7 @@
         <w:pStyle w:val="ListBullet"/>
       </w:pPr>
       <w:r>
-        <w:t>Created an analytical data dashboard using Tableau to visualize telemetry and operational metrics</w:t>
+        <w:t>Utilized Excel for data classification and analytical evaluation to drive data-informed conclusions.</w:t>
       </w:r>
     </w:p>
     <w:p>
@@ -78,7 +78,7 @@
         <w:pStyle w:val="ListBullet"/>
       </w:pPr>
       <w:r>
-        <w:t>Utilized Excel to classify data sets and derive structured business conclusions</w:t>
+        <w:t>Designed and built interactive data dashboards using Tableau to clearly communicate visual analytics and data patterns.</w:t>
       </w:r>
     </w:p>
     <w:p>
@@ -110,7 +110,7 @@
         <w:pStyle w:val="ListBullet"/>
       </w:pPr>
       <w:r>
-        <w:t>Raised public awareness on cyber fraud prevention, phishing vectors, and safe digital practices through structured outreach sessions</w:t>
+        <w:t>Engineered and executed Clock Domain Crossing (CDC) verification strategies in SoC designs to identify reliability risks and eliminate metastability issues.</w:t>
       </w:r>
     </w:p>
     <w:p>
@@ -118,7 +118,7 @@
         <w:pStyle w:val="ListBullet"/>
       </w:pPr>
       <w:r>
-        <w:t>Identified and resolved Clock Domain Crossing reliability risks in complex SoC designs using verification strategies</w:t>
+        <w:t>Led an educational campaign on Digital Frauds, creating awareness materials and conducting informative sessions on phishing, online scams, and cyber fraud prevention practices.</w:t>
       </w:r>
     </w:p>
     <w:p>

</xml_diff>